<commit_message>
fix: normaliza el anteproyecto a anteproyecto.docx y preserva su historia
El rename en staging apuntaba a 'AnteProyecto Cancer de mama (2).docx', cuyo destino no existia en el working tree: commitearlo habria registrado el borrado del material fuente del TG.

El blob de (2) era identico al de anteproyecto.docx en HEAD, o sea que el nombre viejo ya era la version (2). Por eso la resolucion limpia no es un rename sino una modificacion de contenido (v2 -> v3): git conserva la historia completa del archivo y no se pierde nada.

El sufijo (N) es un artefacto de descarga del navegador, no una version: se normaliza el nombre para que cada version futura sea un commit mas sobre el mismo archivo.
</commit_message>
<xml_diff>
--- a/docs/anteproyecto/anteproyecto.docx
+++ b/docs/anteproyecto/anteproyecto.docx
@@ -1642,7 +1642,7 @@
                 <w:szCs w:val="20"/>
                 <w:rtl w:val="0"/>
               </w:rPr>
-              <w:t xml:space="preserve">El cáncer de mama es la principal causa de mortalidad por cáncer en las mujeres colombianas cobrándose un estimado de 4752 mujeres al año con un numero de casos anuales en auge, hay varios obstáculos como la escasez de radiólogos sub especializados y capacitados para suplir la cantidad de casos, la variabilidad en la lectura de BI-RADS y la inequidad territorial para atenuar estas cifras, las nuevas tecnologías como la evolución de la inteligencia artificial: sistemas multimodales, foundation models y agentes autónomos son cruciales en la ayuda del diagnóstico medico en Colombia, ya existen soluciones parecidas como Clairity Breast, este anteproyecto formula el diseño e implementación de un sistema inteligente multimodal, usando agentes autónomos y foundation models en el contexto colombiano.</w:t>
+              <w:t xml:space="preserve">El cáncer de mama es la principal causa de mortalidad por cáncer en las mujeres colombianas cobrándose un estimado de 4752 mujeres al año con un número de casos anuales en auge, hay varios obstáculos como la escasez de radiólogos sub especializados y capacitados para suplir la cantidad de casos, la variabilidad en la lectura de BI-RADS y la inequidad territorial para atenuar estas cifras, las nuevas tecnologías como la evolución de la inteligencia artificial: sistemas multimodales, foundation models y agentes autónomos son cruciales en la ayuda del diagnóstico médico en Colombia, ya existen soluciones parecidas como Clairity Breast, este anteproyecto formula el diseño e implementación de un sistema inteligente multimodal, usando agentes autónomos y foundation models en el contexto colombiano.</w:t>
             </w:r>
           </w:p>
           <w:p>
@@ -1728,6 +1728,7 @@
           </w:tcPr>
           <w:p>
             <w:pPr>
+              <w:spacing w:after="240" w:before="240" w:lineRule="auto"/>
               <w:jc w:val="both"/>
               <w:rPr>
                 <w:rFonts w:ascii="Calibri" w:cs="Calibri" w:eastAsia="Calibri" w:hAnsi="Calibri"/>
@@ -1742,11 +1743,12 @@
                 <w:szCs w:val="20"/>
                 <w:rtl w:val="0"/>
               </w:rPr>
-              <w:t xml:space="preserve">El cáncer de mama es la primera mortalidad en mujeres con cáncer en Colombia según los registros poblacionales del Instituto Nacional Cancerígeno, también hay que tener en cuenta el aumento de muertes en la década del 2010 pasando de 2243 muertes en el 2009 a 3.535 en el 2019, ósea un aumento del +36,5% en una década según el MinSalud. Los departamentos como Atlántico, Magdalena, Santander y Valle del Cauca son los departamentos con la tasa de mortalidad más alta.</w:t>
-            </w:r>
-          </w:p>
-          <w:p>
-            <w:pPr>
+              <w:t xml:space="preserve">El cáncer de mama es la primera causa de mortalidad por cáncer en mujeres en Colombia según los registros del Instituto Nacional de Cancerología, con cerca de 3.006 muertes al año según su Atlas de Mortalidad. Los departamentos como Atlántico, Magdalena, Santander y Valle del Cauca son los departamentos con la tasa de mortalidad más alta.</w:t>
+            </w:r>
+          </w:p>
+          <w:p>
+            <w:pPr>
+              <w:spacing w:after="240" w:before="240" w:lineRule="auto"/>
               <w:jc w:val="both"/>
               <w:rPr>
                 <w:rFonts w:ascii="Calibri" w:cs="Calibri" w:eastAsia="Calibri" w:hAnsi="Calibri"/>
@@ -1756,12 +1758,17 @@
             </w:pPr>
             <w:r>
               <w:rPr>
-                <w:rtl w:val="0"/>
-              </w:rPr>
-            </w:r>
-          </w:p>
-          <w:p>
-            <w:pPr>
+                <w:rFonts w:ascii="Calibri" w:cs="Calibri" w:eastAsia="Calibri" w:hAnsi="Calibri"/>
+                <w:sz w:val="20"/>
+                <w:szCs w:val="20"/>
+                <w:rtl w:val="0"/>
+              </w:rPr>
+              <w:t xml:space="preserve">Las causas estructurales de la brecha en el diagnóstico del cáncer de mama son la escasez de radiólogos subespecializados en la imagen mamaria, esto se agudiza en las zonas fuera de las grandes ciudades donde la atención médica se dificulta, hay cierta variabilidad y subjetividad en la clasificación de las imágenes BI-RADS, o sea dos radiólogos pueden calificar de distinta manera la misma mamografía, sin contar el problema de la información clínica fragmentada, la imagen, patología y genómica no se encuentran correlacionadas y a la mano para el diagnóstico.</w:t>
+            </w:r>
+          </w:p>
+          <w:p>
+            <w:pPr>
+              <w:spacing w:after="240" w:before="240" w:lineRule="auto"/>
               <w:jc w:val="both"/>
               <w:rPr>
                 <w:rFonts w:ascii="Calibri" w:cs="Calibri" w:eastAsia="Calibri" w:hAnsi="Calibri"/>
@@ -1776,59 +1783,7 @@
                 <w:szCs w:val="20"/>
                 <w:rtl w:val="0"/>
               </w:rPr>
-              <w:t xml:space="preserve">Las causas estructurales de la brecha en el diagnóstico del cáncer de mama son la escasez de radiólogos sub especializados en la imagen mamaria, esto se agudiza en las zonas fueras de las grandes ciudades donde la atención medica se dificulta,  hay cierta variabilidad y subjetividad en la clasificación de las imágenes BI-RADS ósea dos radiólogos pueden calificar de distinta manera la misma mamografía sin contar el problema de la información clínica fragmentada, la imagen, patología y genómica no se encuentran correlacionadas y a la mano para el diagnóstico.</w:t>
-            </w:r>
-          </w:p>
-          <w:p>
-            <w:pPr>
-              <w:jc w:val="both"/>
-              <w:rPr>
-                <w:rFonts w:ascii="Calibri" w:cs="Calibri" w:eastAsia="Calibri" w:hAnsi="Calibri"/>
-                <w:sz w:val="20"/>
-                <w:szCs w:val="20"/>
-              </w:rPr>
-            </w:pPr>
-            <w:r>
-              <w:rPr>
-                <w:rtl w:val="0"/>
-              </w:rPr>
-            </w:r>
-          </w:p>
-          <w:p>
-            <w:pPr>
-              <w:jc w:val="both"/>
-              <w:rPr>
-                <w:rFonts w:ascii="Calibri" w:cs="Calibri" w:eastAsia="Calibri" w:hAnsi="Calibri"/>
-                <w:sz w:val="20"/>
-                <w:szCs w:val="20"/>
-              </w:rPr>
-            </w:pPr>
-            <w:r>
-              <w:rPr>
-                <w:rFonts w:ascii="Calibri" w:cs="Calibri" w:eastAsia="Calibri" w:hAnsi="Calibri"/>
-                <w:sz w:val="20"/>
-                <w:szCs w:val="20"/>
-                <w:rtl w:val="0"/>
-              </w:rPr>
-              <w:t xml:space="preserve">Ya existen sistema de inteligencia artificial multimodal con la autorización regulatoria correspondiente la gran diferencia es que están pensados y diseñados sobre países y sociedades con altos ingresos y culturas diferentes no en la sociedad colombiana ni pensado para la infraestructura hospitalaria nacional, estos sistemas tampoco cuentan con gobernanza de ia, explicabilidad clínica ni verificación de cumplimiento del INVIMA, todo esto se implementará en nuestro sistema, la pregunta problema es la siguiente: </w:t>
-            </w:r>
-            <w:r>
-              <w:rPr>
-                <w:rFonts w:ascii="Calibri" w:cs="Calibri" w:eastAsia="Calibri" w:hAnsi="Calibri"/>
-                <w:b w:val="1"/>
-                <w:bCs w:val="1"/>
-                <w:i w:val="1"/>
-                <w:iCs w:val="1"/>
-                <w:sz w:val="20"/>
-                <w:szCs w:val="20"/>
-                <w:rtl w:val="0"/>
-              </w:rPr>
-              <w:t xml:space="preserve">¿Cómo diseñar e implementar un sistema inteligente multimodal, basado en agentes autónomos de IA y foundation models médicos, que mejore la sensibilidad, especificidad y explicabilidad en la detección temprana del cáncer de mama en el contexto clínico colombiano?</w:t>
-            </w:r>
-            <w:r>
-              <w:rPr>
-                <w:rtl w:val="0"/>
-              </w:rPr>
+              <w:t xml:space="preserve">Ya existen sistemas de inteligencia artificial para mamografía con la autorización regulatoria correspondiente, la gran diferencia es que están pensados y diseñados sobre países y sociedades con altos ingresos y culturas diferentes, no en la sociedad colombiana ni pensados para la infraestructura hospitalaria nacional, estos sistemas tampoco cuentan con gobernanza de IA ni explicabilidad clínica documentada conforme a lo que exige el INVIMA, esto es lo que nuestro sistema busca resolver. La pregunta problema es la siguiente: ¿Cómo diseñar e implementar un sistema de agentes autónomos de IA que, mediante transfer learning sobre mamografía digital 2D, mejore la sensibilidad, especificidad y explicabilidad en la detección temprana de hallazgos sospechosos de cáncer de mama en el contexto clínico colombiano?</w:t>
             </w:r>
           </w:p>
           <w:p>
@@ -1969,6 +1924,7 @@
           </w:tcPr>
           <w:p>
             <w:pPr>
+              <w:spacing w:after="240" w:before="240" w:lineRule="auto"/>
               <w:jc w:val="both"/>
               <w:rPr>
                 <w:rFonts w:ascii="Calibri" w:cs="Calibri" w:eastAsia="Calibri" w:hAnsi="Calibri"/>
@@ -1983,12 +1939,12 @@
                 <w:szCs w:val="20"/>
                 <w:rtl w:val="0"/>
               </w:rPr>
-              <w:t xml:space="preserve">La detección temprana es la mejor forma de reducir la mortalidad donde la barrera que obstruye la mejoría es la falta de radiólogos subespecializados y la variabilidad en el diagnóstico, todos estos problemas nos lleva a las cifras antes mencionadas, una tasa de mortalidad de 11,4 de 100000 pacientes, o el aumento significativo que hubo en la década de un +36.5% del 2010,  un sistema de este tipo bien estructurado y con una arquitectura clara y optimizada impacta en la vida, no solo en la eficiencia. Un sistema liviano y optimizado puede llevar la capacidad de lectura y análisis a sitios donde no hay radiólogos especializados para aquello esto mismo se alinea con el Plan Decenal para el Control del Cáncer en Colombia cuyo objetivo es reducir la incidencia y mortalidad de la enfermedad, garantizando la atención integral, el diagnóstico temprano  de los pacientes en todo el país.</w:t>
-              <w:br w:type="textWrapping"/>
-            </w:r>
-          </w:p>
-          <w:p>
-            <w:pPr>
+              <w:t xml:space="preserve">La detección temprana es la mejor forma de reducir la mortalidad donde la barrera que obstruye la mejoría es la falta de radiólogos subespecializados y la variabilidad en el diagnóstico, todos estos problemas nos llevan a las cifras antes mencionadas, cerca de 3.006 muertes al año por cáncer de mama en mujeres colombianas según el Atlas de Mortalidad del INC, un sistema de este tipo bien estructurado y con una arquitectura clara y optimizada impacta en la vida, no solo en la eficiencia. Un sistema liviano y optimizado puede llevar la capacidad de lectura y análisis a sitios donde no hay radiólogos especializados para aquello, esto mismo se alinea con el Plan Decenal para el Control del Cáncer en Colombia cuyo objetivo es reducir la incidencia y mortalidad de la enfermedad, garantizando la atención integral, el diagnóstico temprano de los pacientes en todo el país.</w:t>
+            </w:r>
+          </w:p>
+          <w:p>
+            <w:pPr>
+              <w:spacing w:after="240" w:before="240" w:lineRule="auto"/>
               <w:jc w:val="both"/>
               <w:rPr>
                 <w:rFonts w:ascii="Calibri" w:cs="Calibri" w:eastAsia="Calibri" w:hAnsi="Calibri"/>
@@ -2003,25 +1959,22 @@
                 <w:szCs w:val="20"/>
                 <w:rtl w:val="0"/>
               </w:rPr>
-              <w:t xml:space="preserve">Las tecnologías planteadas a usar en este proyecto son tecnologías vanguardistas como agentes de inteligencia artificial, foundation models médicos y aprendizaje federado todas estas tecnologías definen la evolución de la radiología a sistemas de apoyo para la toma de decisiones médicas con un enfoque en multiagentes médicos para tareas especializadas, ya existen soluciones con un concepto parecido como </w:t>
-            </w:r>
-            <w:r>
-              <w:rPr>
-                <w:rFonts w:ascii="Calibri" w:cs="Calibri" w:eastAsia="Calibri" w:hAnsi="Calibri"/>
-                <w:sz w:val="20"/>
-                <w:szCs w:val="20"/>
-                <w:rtl w:val="0"/>
-              </w:rPr>
-              <w:t xml:space="preserve">ClarityBreast</w:t>
-            </w:r>
-            <w:r>
-              <w:rPr>
-                <w:rFonts w:ascii="Calibri" w:cs="Calibri" w:eastAsia="Calibri" w:hAnsi="Calibri"/>
-                <w:sz w:val="20"/>
-                <w:szCs w:val="20"/>
-                <w:rtl w:val="0"/>
-              </w:rPr>
-              <w:t xml:space="preserve"> que nos ayuda a saber que el modelo multimodal funciona y da resultados, lo diferenciador en este proyecto es que no está basado en infraestructuras y sociedades de primer mundo con altos ingreso, el valor agregado es que se pueda usar esta tecnología en todos los rincones del país usando los estándares clínicos usados aquí, como el archivo dicom, y la gobernanza correspondiente a las reglas y normas del país ante el INVIMA, algo que las soluciones actuales suelen olvidar.</w:t>
+              <w:t xml:space="preserve">Las tecnologías planteadas a usar en este proyecto son tecnologías vanguardistas como agentes de inteligencia artificial y modelos de visión ajustados mediante transfer learning, todas estas tecnologías definen la evolución de la radiología a sistemas de apoyo para la toma de decisiones médicas con un enfoque en multiagentes médicos para tareas especializadas, ya existen soluciones con un concepto parecido como Clairity Breast que nos ayuda a saber que el enfoque de IA en mamografía funciona y da resultados, aunque Clairity predice el riesgo a cinco años y nuestro proyecto se enfoca en el triaje de hallazgos ya presentes en la mamografía, son tareas distintas pero que validan el mismo camino. Lo diferenciador en este proyecto es que no está basado en infraestructuras y sociedades de primer mundo con altos ingreso, el valor agregado es que se pueda usar esta tecnología en todos los rincones del país usando los estándares clínicos usados aquí, como el archivo DICOM, y documentando el diseño conforme a las reglas y normas del país ante el INVIMA, algo que las soluciones actuales suelen olvidar.</w:t>
+            </w:r>
+          </w:p>
+          <w:p>
+            <w:pPr>
+              <w:jc w:val="both"/>
+              <w:rPr>
+                <w:rFonts w:ascii="Calibri" w:cs="Calibri" w:eastAsia="Calibri" w:hAnsi="Calibri"/>
+                <w:sz w:val="20"/>
+                <w:szCs w:val="20"/>
+              </w:rPr>
+            </w:pPr>
+            <w:r>
+              <w:rPr>
+                <w:rtl w:val="0"/>
+              </w:rPr>
             </w:r>
           </w:p>
           <w:p>
@@ -2352,19 +2305,102 @@
           </w:tcPr>
           <w:p>
             <w:pPr>
+              <w:spacing w:after="240" w:before="240" w:lineRule="auto"/>
               <w:jc w:val="both"/>
               <w:rPr>
                 <w:rFonts w:ascii="Calibri" w:cs="Calibri" w:eastAsia="Calibri" w:hAnsi="Calibri"/>
-                <w:b w:val="1"/>
-                <w:bCs w:val="1"/>
-                <w:sz w:val="20"/>
-                <w:szCs w:val="20"/>
-              </w:rPr>
-            </w:pPr>
-            <w:r>
-              <w:rPr>
-                <w:rtl w:val="0"/>
-              </w:rPr>
+                <w:sz w:val="20"/>
+                <w:szCs w:val="20"/>
+              </w:rPr>
+            </w:pPr>
+            <w:r>
+              <w:rPr>
+                <w:rFonts w:ascii="Calibri" w:cs="Calibri" w:eastAsia="Calibri" w:hAnsi="Calibri"/>
+                <w:sz w:val="20"/>
+                <w:szCs w:val="20"/>
+                <w:rtl w:val="0"/>
+              </w:rPr>
+              <w:t xml:space="preserve">Este proyecto se apoya en el deep learning aplicado a imagen médica, puntualmente sobre mamografía digital 2D, que es la tarea que vamos a resolver en la práctica: clasificar si un hallazgo en la mamografía es sospechoso de malignidad o no. Para esto usamos Vision Transformers (ViT), que en vez de mirar la imagen de forma local como una CNN, la dividen en parches y los relacionan entre sí, esto ayuda a detectar hallazgos que no están concentrados en un solo punto del tejido. No entrenamos un foundation model desde cero, lo que hacemos es transfer learning, es decir, partimos de un modelo ya preentrenado y lo ajustamos con el dataset de mamografía que vamos a usar (CBIS-DDSM), esto es lo realista dado el tiempo y los recursos de un trabajo de grado.</w:t>
+            </w:r>
+          </w:p>
+          <w:p>
+            <w:pPr>
+              <w:spacing w:after="240" w:before="240" w:lineRule="auto"/>
+              <w:jc w:val="both"/>
+              <w:rPr>
+                <w:rFonts w:ascii="Calibri" w:cs="Calibri" w:eastAsia="Calibri" w:hAnsi="Calibri"/>
+                <w:sz w:val="20"/>
+                <w:szCs w:val="20"/>
+              </w:rPr>
+            </w:pPr>
+            <w:r>
+              <w:rPr>
+                <w:rFonts w:ascii="Calibri" w:cs="Calibri" w:eastAsia="Calibri" w:hAnsi="Calibri"/>
+                <w:sz w:val="20"/>
+                <w:szCs w:val="20"/>
+                <w:rtl w:val="0"/>
+              </w:rPr>
+              <w:t xml:space="preserve">El corazón de la propuesta sigue siendo el sistema multiagente, orquestado con LangGraph. El Agente Radiólogo detecta el hallazgo en la mamografía, el Agente Patólogo correlaciona esa información dentro del flujo, el Agente de Gobernanza de IA vigila que no haya sesgos en el resultado, y el Agente Auditor documenta que el diseño del sistema sea consistente con lo que exige el INVIMA, aclarando que esto es documentación de diseño, no una certificación real ante el ente regulador, eso está fuera del alcance de un trabajo de grado.</w:t>
+            </w:r>
+          </w:p>
+          <w:p>
+            <w:pPr>
+              <w:spacing w:after="240" w:before="240" w:lineRule="auto"/>
+              <w:jc w:val="both"/>
+              <w:rPr>
+                <w:rFonts w:ascii="Calibri" w:cs="Calibri" w:eastAsia="Calibri" w:hAnsi="Calibri"/>
+                <w:sz w:val="20"/>
+                <w:szCs w:val="20"/>
+              </w:rPr>
+            </w:pPr>
+            <w:r>
+              <w:rPr>
+                <w:rFonts w:ascii="Calibri" w:cs="Calibri" w:eastAsia="Calibri" w:hAnsi="Calibri"/>
+                <w:sz w:val="20"/>
+                <w:szCs w:val="20"/>
+                <w:rtl w:val="0"/>
+              </w:rPr>
+              <w:t xml:space="preserve">Para que el radiólogo pueda confiar en lo que el modelo detecta, usamos Grad-CAM como técnica de explicabilidad (XAI), que genera un mapa de calor sobre la mamografía mostrando en qué región se basó el modelo para decidir, sin esto ningún hallazgo automático es confiable para uso clínico. También consideramos Edge AI para correr el modelo cerca del paciente sin depender de buena conexión, y HPC para el entrenamiento, aunque esto último aplica más a la fase de entrenamiento del modelo que al uso diario del sistema.</w:t>
+            </w:r>
+          </w:p>
+          <w:p>
+            <w:pPr>
+              <w:spacing w:after="240" w:before="240" w:lineRule="auto"/>
+              <w:jc w:val="both"/>
+              <w:rPr>
+                <w:rFonts w:ascii="Calibri" w:cs="Calibri" w:eastAsia="Calibri" w:hAnsi="Calibri"/>
+                <w:sz w:val="20"/>
+                <w:szCs w:val="20"/>
+              </w:rPr>
+            </w:pPr>
+            <w:r>
+              <w:rPr>
+                <w:rFonts w:ascii="Calibri" w:cs="Calibri" w:eastAsia="Calibri" w:hAnsi="Calibri"/>
+                <w:sz w:val="20"/>
+                <w:szCs w:val="20"/>
+                <w:rtl w:val="0"/>
+              </w:rPr>
+              <w:t xml:space="preserve">En cuanto al contexto, el cáncer de mama sigue siendo la principal causa de mortalidad por cáncer en mujeres colombianas, con cerca de 3.006 muertes al año según el Atlas de Mortalidad del Instituto Nacional de Cancerología, y con escasez de radiólogos subespecializados fuera de las grandes ciudades. A nivel normativo, la interoperabilidad técnica se apoya en DICOM, HL7 FHIR y SNOMED CT.</w:t>
+            </w:r>
+          </w:p>
+          <w:p>
+            <w:pPr>
+              <w:spacing w:after="240" w:before="240" w:lineRule="auto"/>
+              <w:jc w:val="both"/>
+              <w:rPr>
+                <w:rFonts w:ascii="Calibri" w:cs="Calibri" w:eastAsia="Calibri" w:hAnsi="Calibri"/>
+                <w:sz w:val="20"/>
+                <w:szCs w:val="20"/>
+              </w:rPr>
+            </w:pPr>
+            <w:r>
+              <w:rPr>
+                <w:rFonts w:ascii="Calibri" w:cs="Calibri" w:eastAsia="Calibri" w:hAnsi="Calibri"/>
+                <w:sz w:val="20"/>
+                <w:szCs w:val="20"/>
+                <w:rtl w:val="0"/>
+              </w:rPr>
+              <w:t xml:space="preserve">Sobre el estado del arte, el referente más conocido es Clairity Breast, primer modelo de IA autorizado por la FDA (junio de 2025) e incluido en las guías NCCN en 2026, aunque hay que aclarar que Clairity predice el riesgo de desarrollar cáncer a cinco años, una tarea distinta a la nuestra, que es el triaje de un hallazgo ya presente en la mamografía. También existe el sistema multimodal de Park, Witowski y su equipo de NYU (2025), que combina mamografía 2D y tomosíntesis 3D y demostró reducir el trabajo del radiólogo sin perder sensibilidad, esto confirma que hay valor en estos enfoques, aunque nuestro alcance actual se limita a 2D.</w:t>
             </w:r>
           </w:p>
         </w:tc>
@@ -4592,8 +4628,12 @@
                   </w:pPr>
                   <w:r>
                     <w:rPr>
-                      <w:rtl w:val="0"/>
-                    </w:rPr>
+                      <w:rFonts w:ascii="Calibri" w:cs="Calibri" w:eastAsia="Calibri" w:hAnsi="Calibri"/>
+                      <w:sz w:val="16"/>
+                      <w:szCs w:val="16"/>
+                      <w:rtl w:val="0"/>
+                    </w:rPr>
+                    <w:t xml:space="preserve">X</w:t>
                   </w:r>
                 </w:p>
               </w:tc>
@@ -4703,8 +4743,12 @@
                   </w:pPr>
                   <w:r>
                     <w:rPr>
-                      <w:rtl w:val="0"/>
-                    </w:rPr>
+                      <w:rFonts w:ascii="Calibri" w:cs="Calibri" w:eastAsia="Calibri" w:hAnsi="Calibri"/>
+                      <w:sz w:val="16"/>
+                      <w:szCs w:val="16"/>
+                      <w:rtl w:val="0"/>
+                    </w:rPr>
+                    <w:t xml:space="preserve">X</w:t>
                   </w:r>
                 </w:p>
               </w:tc>
@@ -5076,8 +5120,12 @@
                   </w:pPr>
                   <w:r>
                     <w:rPr>
-                      <w:rtl w:val="0"/>
-                    </w:rPr>
+                      <w:rFonts w:ascii="Calibri" w:cs="Calibri" w:eastAsia="Calibri" w:hAnsi="Calibri"/>
+                      <w:sz w:val="16"/>
+                      <w:szCs w:val="16"/>
+                      <w:rtl w:val="0"/>
+                    </w:rPr>
+                    <w:t xml:space="preserve">X</w:t>
                   </w:r>
                 </w:p>
               </w:tc>
@@ -5238,68 +5286,84 @@
                   </w:pPr>
                   <w:r>
                     <w:rPr>
-                      <w:rtl w:val="0"/>
-                    </w:rPr>
-                  </w:r>
-                </w:p>
-              </w:tc>
-              <w:tc>
-                <w:tcPr>
-                  <w:shd w:fill="auto" w:val="clear"/>
-                  <w:vAlign w:val="center"/>
-                </w:tcPr>
-                <w:p>
-                  <w:pPr>
-                    <w:rPr>
-                      <w:rFonts w:ascii="Calibri" w:cs="Calibri" w:eastAsia="Calibri" w:hAnsi="Calibri"/>
-                      <w:sz w:val="16"/>
-                      <w:szCs w:val="16"/>
-                    </w:rPr>
-                  </w:pPr>
-                  <w:r>
-                    <w:rPr>
-                      <w:rtl w:val="0"/>
-                    </w:rPr>
-                  </w:r>
-                </w:p>
-              </w:tc>
-              <w:tc>
-                <w:tcPr>
-                  <w:shd w:fill="auto" w:val="clear"/>
-                  <w:vAlign w:val="center"/>
-                </w:tcPr>
-                <w:p>
-                  <w:pPr>
-                    <w:rPr>
-                      <w:rFonts w:ascii="Calibri" w:cs="Calibri" w:eastAsia="Calibri" w:hAnsi="Calibri"/>
-                      <w:sz w:val="16"/>
-                      <w:szCs w:val="16"/>
-                    </w:rPr>
-                  </w:pPr>
-                  <w:r>
-                    <w:rPr>
-                      <w:rtl w:val="0"/>
-                    </w:rPr>
-                  </w:r>
-                </w:p>
-              </w:tc>
-              <w:tc>
-                <w:tcPr>
-                  <w:shd w:fill="auto" w:val="clear"/>
-                  <w:vAlign w:val="center"/>
-                </w:tcPr>
-                <w:p>
-                  <w:pPr>
-                    <w:rPr>
-                      <w:rFonts w:ascii="Calibri" w:cs="Calibri" w:eastAsia="Calibri" w:hAnsi="Calibri"/>
-                      <w:sz w:val="16"/>
-                      <w:szCs w:val="16"/>
-                    </w:rPr>
-                  </w:pPr>
-                  <w:r>
-                    <w:rPr>
-                      <w:rtl w:val="0"/>
-                    </w:rPr>
+                      <w:rFonts w:ascii="Calibri" w:cs="Calibri" w:eastAsia="Calibri" w:hAnsi="Calibri"/>
+                      <w:sz w:val="16"/>
+                      <w:szCs w:val="16"/>
+                      <w:rtl w:val="0"/>
+                    </w:rPr>
+                    <w:t xml:space="preserve">0$</w:t>
+                  </w:r>
+                </w:p>
+              </w:tc>
+              <w:tc>
+                <w:tcPr>
+                  <w:shd w:fill="auto" w:val="clear"/>
+                  <w:vAlign w:val="center"/>
+                </w:tcPr>
+                <w:p>
+                  <w:pPr>
+                    <w:rPr>
+                      <w:rFonts w:ascii="Calibri" w:cs="Calibri" w:eastAsia="Calibri" w:hAnsi="Calibri"/>
+                      <w:sz w:val="16"/>
+                      <w:szCs w:val="16"/>
+                    </w:rPr>
+                  </w:pPr>
+                  <w:r>
+                    <w:rPr>
+                      <w:rFonts w:ascii="Calibri" w:cs="Calibri" w:eastAsia="Calibri" w:hAnsi="Calibri"/>
+                      <w:sz w:val="16"/>
+                      <w:szCs w:val="16"/>
+                      <w:rtl w:val="0"/>
+                    </w:rPr>
+                    <w:t xml:space="preserve">En especie</w:t>
+                  </w:r>
+                </w:p>
+              </w:tc>
+              <w:tc>
+                <w:tcPr>
+                  <w:shd w:fill="auto" w:val="clear"/>
+                  <w:vAlign w:val="center"/>
+                </w:tcPr>
+                <w:p>
+                  <w:pPr>
+                    <w:rPr>
+                      <w:rFonts w:ascii="Calibri" w:cs="Calibri" w:eastAsia="Calibri" w:hAnsi="Calibri"/>
+                      <w:sz w:val="16"/>
+                      <w:szCs w:val="16"/>
+                    </w:rPr>
+                  </w:pPr>
+                  <w:r>
+                    <w:rPr>
+                      <w:rFonts w:ascii="Calibri" w:cs="Calibri" w:eastAsia="Calibri" w:hAnsi="Calibri"/>
+                      <w:sz w:val="16"/>
+                      <w:szCs w:val="16"/>
+                      <w:rtl w:val="0"/>
+                    </w:rPr>
+                    <w:t xml:space="preserve">0$</w:t>
+                  </w:r>
+                </w:p>
+              </w:tc>
+              <w:tc>
+                <w:tcPr>
+                  <w:shd w:fill="auto" w:val="clear"/>
+                  <w:vAlign w:val="center"/>
+                </w:tcPr>
+                <w:p>
+                  <w:pPr>
+                    <w:rPr>
+                      <w:rFonts w:ascii="Calibri" w:cs="Calibri" w:eastAsia="Calibri" w:hAnsi="Calibri"/>
+                      <w:sz w:val="16"/>
+                      <w:szCs w:val="16"/>
+                    </w:rPr>
+                  </w:pPr>
+                  <w:r>
+                    <w:rPr>
+                      <w:rFonts w:ascii="Calibri" w:cs="Calibri" w:eastAsia="Calibri" w:hAnsi="Calibri"/>
+                      <w:sz w:val="16"/>
+                      <w:szCs w:val="16"/>
+                      <w:rtl w:val="0"/>
+                    </w:rPr>
+                    <w:t xml:space="preserve">En especie</w:t>
                   </w:r>
                 </w:p>
               </w:tc>

</xml_diff>